<commit_message>
Fix heading pagination — add keepNext/keepLines to all 178 headings
Prevents headings from appearing at the bottom of a page with their
content starting on the next page. Applied to all 9 revised documents.
</commit_message>
<xml_diff>
--- a/revised-april-2026/BWP_ADV_Part_2A___2B(v.04.2026).docx
+++ b/revised-april-2026/BWP_ADV_Part_2A___2B(v.04.2026).docx
@@ -4,6 +4,8 @@
   <w:body>
     <w:p>
       <w:pPr>
+        <w:keepNext/>
+        <w:keepLines/>
         <w:spacing w:after="240" w:before="1440"/>
         <w:jc w:val="center"/>
       </w:pPr>
@@ -21,6 +23,8 @@
     </w:p>
     <w:p>
       <w:pPr>
+        <w:keepNext/>
+        <w:keepLines/>
         <w:spacing w:after="200"/>
         <w:jc w:val="center"/>
       </w:pPr>
@@ -149,6 +153,8 @@
       <w:pPr>
         <w:pStyle w:val="Heading1"/>
         <w:spacing w:after="160" w:before="360"/>
+        <w:keepNext/>
+        <w:keepLines/>
       </w:pPr>
       <w:r>
         <w:rPr>
@@ -308,6 +314,8 @@
       <w:pPr>
         <w:pStyle w:val="Heading1"/>
         <w:spacing w:after="160" w:before="360"/>
+        <w:keepNext/>
+        <w:keepLines/>
       </w:pPr>
       <w:r>
         <w:rPr>
@@ -648,6 +656,8 @@
       <w:pPr>
         <w:pStyle w:val="Heading1"/>
         <w:spacing w:after="160" w:before="360"/>
+        <w:keepNext/>
+        <w:keepLines/>
       </w:pPr>
       <w:r>
         <w:rPr>
@@ -665,6 +675,8 @@
       <w:pPr>
         <w:pStyle w:val="Heading2"/>
         <w:spacing w:after="120" w:before="280"/>
+        <w:keepNext/>
+        <w:keepLines/>
       </w:pPr>
       <w:r>
         <w:rPr>
@@ -710,6 +722,8 @@
       <w:pPr>
         <w:pStyle w:val="Heading2"/>
         <w:spacing w:after="120" w:before="280"/>
+        <w:keepNext/>
+        <w:keepLines/>
       </w:pPr>
       <w:r>
         <w:rPr>
@@ -741,6 +755,8 @@
       <w:pPr>
         <w:pStyle w:val="Heading2"/>
         <w:spacing w:after="120" w:before="280"/>
+        <w:keepNext/>
+        <w:keepLines/>
       </w:pPr>
       <w:r>
         <w:rPr>
@@ -814,6 +830,8 @@
       <w:pPr>
         <w:pStyle w:val="Heading2"/>
         <w:spacing w:after="120" w:before="280"/>
+        <w:keepNext/>
+        <w:keepLines/>
       </w:pPr>
       <w:r>
         <w:rPr>
@@ -845,6 +863,8 @@
       <w:pPr>
         <w:pStyle w:val="Heading2"/>
         <w:spacing w:after="120" w:before="280"/>
+        <w:keepNext/>
+        <w:keepLines/>
       </w:pPr>
       <w:r>
         <w:rPr>
@@ -890,6 +910,8 @@
       <w:pPr>
         <w:pStyle w:val="Heading2"/>
         <w:spacing w:after="120" w:before="280"/>
+        <w:keepNext/>
+        <w:keepLines/>
       </w:pPr>
       <w:r>
         <w:rPr>
@@ -921,6 +943,8 @@
       <w:pPr>
         <w:pStyle w:val="Heading2"/>
         <w:spacing w:after="120" w:before="280"/>
+        <w:keepNext/>
+        <w:keepLines/>
       </w:pPr>
       <w:r>
         <w:rPr>
@@ -952,6 +976,8 @@
       <w:pPr>
         <w:pStyle w:val="Heading2"/>
         <w:spacing w:after="120" w:before="280"/>
+        <w:keepNext/>
+        <w:keepLines/>
       </w:pPr>
       <w:r>
         <w:rPr>
@@ -983,6 +1009,8 @@
       <w:pPr>
         <w:pStyle w:val="Heading2"/>
         <w:spacing w:after="120" w:before="280"/>
+        <w:keepNext/>
+        <w:keepLines/>
       </w:pPr>
       <w:r>
         <w:rPr>
@@ -1014,6 +1042,8 @@
       <w:pPr>
         <w:pStyle w:val="Heading2"/>
         <w:spacing w:after="120" w:before="280"/>
+        <w:keepNext/>
+        <w:keepLines/>
       </w:pPr>
       <w:r>
         <w:rPr>
@@ -1045,6 +1075,8 @@
       <w:pPr>
         <w:pStyle w:val="Heading2"/>
         <w:spacing w:after="120" w:before="280"/>
+        <w:keepNext/>
+        <w:keepLines/>
       </w:pPr>
       <w:r>
         <w:rPr>
@@ -1076,6 +1108,8 @@
       <w:pPr>
         <w:pStyle w:val="Heading2"/>
         <w:spacing w:after="120" w:before="280"/>
+        <w:keepNext/>
+        <w:keepLines/>
       </w:pPr>
       <w:r>
         <w:rPr>
@@ -1107,6 +1141,8 @@
       <w:pPr>
         <w:pStyle w:val="Heading2"/>
         <w:spacing w:after="120" w:before="280"/>
+        <w:keepNext/>
+        <w:keepLines/>
       </w:pPr>
       <w:r>
         <w:rPr>
@@ -1138,6 +1174,8 @@
       <w:pPr>
         <w:pStyle w:val="Heading1"/>
         <w:spacing w:after="160" w:before="360"/>
+        <w:keepNext/>
+        <w:keepLines/>
       </w:pPr>
       <w:r>
         <w:rPr>
@@ -1183,6 +1221,8 @@
       <w:pPr>
         <w:pStyle w:val="Heading2"/>
         <w:spacing w:after="120" w:before="280"/>
+        <w:keepNext/>
+        <w:keepLines/>
       </w:pPr>
       <w:r>
         <w:rPr>
@@ -1503,6 +1543,8 @@
       <w:pPr>
         <w:pStyle w:val="Heading2"/>
         <w:spacing w:after="120" w:before="280"/>
+        <w:keepNext/>
+        <w:keepLines/>
       </w:pPr>
       <w:r>
         <w:rPr>
@@ -1548,6 +1590,8 @@
       <w:pPr>
         <w:pStyle w:val="Heading2"/>
         <w:spacing w:after="120" w:before="280"/>
+        <w:keepNext/>
+        <w:keepLines/>
       </w:pPr>
       <w:r>
         <w:rPr>
@@ -1579,6 +1623,8 @@
       <w:pPr>
         <w:pStyle w:val="Heading2"/>
         <w:spacing w:after="120" w:before="280"/>
+        <w:keepNext/>
+        <w:keepLines/>
       </w:pPr>
       <w:r>
         <w:rPr>
@@ -1885,6 +1931,8 @@
       <w:pPr>
         <w:pStyle w:val="Heading2"/>
         <w:spacing w:after="120" w:before="280"/>
+        <w:keepNext/>
+        <w:keepLines/>
       </w:pPr>
       <w:r>
         <w:rPr>
@@ -1916,6 +1964,8 @@
       <w:pPr>
         <w:pStyle w:val="Heading2"/>
         <w:spacing w:after="120" w:before="280"/>
+        <w:keepNext/>
+        <w:keepLines/>
       </w:pPr>
       <w:r>
         <w:rPr>
@@ -1989,6 +2039,8 @@
       <w:pPr>
         <w:pStyle w:val="Heading2"/>
         <w:spacing w:after="120" w:before="280"/>
+        <w:keepNext/>
+        <w:keepLines/>
       </w:pPr>
       <w:r>
         <w:rPr>
@@ -2020,6 +2072,8 @@
       <w:pPr>
         <w:pStyle w:val="Heading2"/>
         <w:spacing w:after="120" w:before="280"/>
+        <w:keepNext/>
+        <w:keepLines/>
       </w:pPr>
       <w:r>
         <w:rPr>
@@ -2079,6 +2133,8 @@
       <w:pPr>
         <w:pStyle w:val="Heading2"/>
         <w:spacing w:after="120" w:before="280"/>
+        <w:keepNext/>
+        <w:keepLines/>
       </w:pPr>
       <w:r>
         <w:rPr>
@@ -2110,6 +2166,8 @@
       <w:pPr>
         <w:pStyle w:val="Heading1"/>
         <w:spacing w:after="160" w:before="360"/>
+        <w:keepNext/>
+        <w:keepLines/>
       </w:pPr>
       <w:r>
         <w:rPr>
@@ -2141,6 +2199,8 @@
       <w:pPr>
         <w:pStyle w:val="Heading1"/>
         <w:spacing w:after="160" w:before="360"/>
+        <w:keepNext/>
+        <w:keepLines/>
       </w:pPr>
       <w:r>
         <w:rPr>
@@ -2186,6 +2246,8 @@
       <w:pPr>
         <w:pStyle w:val="Heading1"/>
         <w:spacing w:after="160" w:before="360"/>
+        <w:keepNext/>
+        <w:keepLines/>
       </w:pPr>
       <w:r>
         <w:rPr>
@@ -2217,6 +2279,8 @@
       <w:pPr>
         <w:pStyle w:val="Heading2"/>
         <w:spacing w:after="120" w:before="280"/>
+        <w:keepNext/>
+        <w:keepLines/>
       </w:pPr>
       <w:r>
         <w:rPr>
@@ -2332,6 +2396,8 @@
       <w:pPr>
         <w:pStyle w:val="Heading2"/>
         <w:spacing w:after="120" w:before="280"/>
+        <w:keepNext/>
+        <w:keepLines/>
       </w:pPr>
       <w:r>
         <w:rPr>
@@ -2419,6 +2485,8 @@
       <w:pPr>
         <w:pStyle w:val="Heading2"/>
         <w:spacing w:after="120" w:before="280"/>
+        <w:keepNext/>
+        <w:keepLines/>
       </w:pPr>
       <w:r>
         <w:rPr>
@@ -2464,6 +2532,8 @@
       <w:pPr>
         <w:pStyle w:val="Heading1"/>
         <w:spacing w:after="160" w:before="360"/>
+        <w:keepNext/>
+        <w:keepLines/>
       </w:pPr>
       <w:r>
         <w:rPr>
@@ -2481,6 +2551,8 @@
       <w:pPr>
         <w:pStyle w:val="Heading2"/>
         <w:spacing w:after="120" w:before="280"/>
+        <w:keepNext/>
+        <w:keepLines/>
       </w:pPr>
       <w:r>
         <w:rPr>
@@ -2512,6 +2584,8 @@
       <w:pPr>
         <w:pStyle w:val="Heading2"/>
         <w:spacing w:after="120" w:before="280"/>
+        <w:keepNext/>
+        <w:keepLines/>
       </w:pPr>
       <w:r>
         <w:rPr>
@@ -2543,6 +2617,8 @@
       <w:pPr>
         <w:pStyle w:val="Heading2"/>
         <w:spacing w:after="120" w:before="280"/>
+        <w:keepNext/>
+        <w:keepLines/>
       </w:pPr>
       <w:r>
         <w:rPr>
@@ -2574,6 +2650,8 @@
       <w:pPr>
         <w:pStyle w:val="Heading1"/>
         <w:spacing w:after="160" w:before="360"/>
+        <w:keepNext/>
+        <w:keepLines/>
       </w:pPr>
       <w:r>
         <w:rPr>
@@ -2591,6 +2669,8 @@
       <w:pPr>
         <w:pStyle w:val="Heading2"/>
         <w:spacing w:after="120" w:before="280"/>
+        <w:keepNext/>
+        <w:keepLines/>
       </w:pPr>
       <w:r>
         <w:rPr>
@@ -2622,6 +2702,8 @@
       <w:pPr>
         <w:pStyle w:val="Heading2"/>
         <w:spacing w:after="120" w:before="280"/>
+        <w:keepNext/>
+        <w:keepLines/>
       </w:pPr>
       <w:r>
         <w:rPr>
@@ -2653,6 +2735,8 @@
       <w:pPr>
         <w:pStyle w:val="Heading2"/>
         <w:spacing w:after="120" w:before="280"/>
+        <w:keepNext/>
+        <w:keepLines/>
       </w:pPr>
       <w:r>
         <w:rPr>
@@ -2698,6 +2782,8 @@
       <w:pPr>
         <w:pStyle w:val="Heading2"/>
         <w:spacing w:after="120" w:before="280"/>
+        <w:keepNext/>
+        <w:keepLines/>
       </w:pPr>
       <w:r>
         <w:rPr>
@@ -2729,6 +2815,8 @@
       <w:pPr>
         <w:pStyle w:val="Heading1"/>
         <w:spacing w:after="160" w:before="360"/>
+        <w:keepNext/>
+        <w:keepLines/>
       </w:pPr>
       <w:r>
         <w:rPr>
@@ -2760,6 +2848,8 @@
       <w:pPr>
         <w:pStyle w:val="Heading2"/>
         <w:spacing w:after="120" w:before="280"/>
+        <w:keepNext/>
+        <w:keepLines/>
       </w:pPr>
       <w:r>
         <w:rPr>
@@ -2938,6 +3028,8 @@
       <w:pPr>
         <w:pStyle w:val="Heading2"/>
         <w:spacing w:after="120" w:before="280"/>
+        <w:keepNext/>
+        <w:keepLines/>
       </w:pPr>
       <w:r>
         <w:rPr>
@@ -2969,6 +3061,8 @@
       <w:pPr>
         <w:pStyle w:val="Heading2"/>
         <w:spacing w:after="120" w:before="280"/>
+        <w:keepNext/>
+        <w:keepLines/>
       </w:pPr>
       <w:r>
         <w:rPr>
@@ -3000,6 +3094,8 @@
       <w:pPr>
         <w:pStyle w:val="Heading2"/>
         <w:spacing w:after="120" w:before="280"/>
+        <w:keepNext/>
+        <w:keepLines/>
       </w:pPr>
       <w:r>
         <w:rPr>
@@ -3031,6 +3127,8 @@
       <w:pPr>
         <w:pStyle w:val="Heading1"/>
         <w:spacing w:after="160" w:before="360"/>
+        <w:keepNext/>
+        <w:keepLines/>
       </w:pPr>
       <w:r>
         <w:rPr>
@@ -3048,6 +3146,8 @@
       <w:pPr>
         <w:pStyle w:val="Heading2"/>
         <w:spacing w:after="120" w:before="280"/>
+        <w:keepNext/>
+        <w:keepLines/>
       </w:pPr>
       <w:r>
         <w:rPr>
@@ -3107,6 +3207,8 @@
       <w:pPr>
         <w:pStyle w:val="Heading2"/>
         <w:spacing w:after="120" w:before="280"/>
+        <w:keepNext/>
+        <w:keepLines/>
       </w:pPr>
       <w:r>
         <w:rPr>
@@ -3138,6 +3240,8 @@
       <w:pPr>
         <w:pStyle w:val="Heading2"/>
         <w:spacing w:after="120" w:before="280"/>
+        <w:keepNext/>
+        <w:keepLines/>
       </w:pPr>
       <w:r>
         <w:rPr>
@@ -3169,6 +3273,8 @@
       <w:pPr>
         <w:pStyle w:val="Heading2"/>
         <w:spacing w:after="120" w:before="280"/>
+        <w:keepNext/>
+        <w:keepLines/>
       </w:pPr>
       <w:r>
         <w:rPr>
@@ -3200,6 +3306,8 @@
       <w:pPr>
         <w:pStyle w:val="Heading2"/>
         <w:spacing w:after="120" w:before="280"/>
+        <w:keepNext/>
+        <w:keepLines/>
       </w:pPr>
       <w:r>
         <w:rPr>
@@ -3231,6 +3339,8 @@
       <w:pPr>
         <w:pStyle w:val="Heading1"/>
         <w:spacing w:after="160" w:before="360"/>
+        <w:keepNext/>
+        <w:keepLines/>
       </w:pPr>
       <w:r>
         <w:rPr>
@@ -3248,6 +3358,8 @@
       <w:pPr>
         <w:pStyle w:val="Heading2"/>
         <w:spacing w:after="120" w:before="280"/>
+        <w:keepNext/>
+        <w:keepLines/>
       </w:pPr>
       <w:r>
         <w:rPr>
@@ -3279,6 +3391,8 @@
       <w:pPr>
         <w:pStyle w:val="Heading2"/>
         <w:spacing w:after="120" w:before="280"/>
+        <w:keepNext/>
+        <w:keepLines/>
       </w:pPr>
       <w:r>
         <w:rPr>
@@ -3310,6 +3424,8 @@
       <w:pPr>
         <w:pStyle w:val="Heading2"/>
         <w:spacing w:after="120" w:before="280"/>
+        <w:keepNext/>
+        <w:keepLines/>
       </w:pPr>
       <w:r>
         <w:rPr>
@@ -3341,6 +3457,8 @@
       <w:pPr>
         <w:pStyle w:val="Heading2"/>
         <w:spacing w:after="120" w:before="280"/>
+        <w:keepNext/>
+        <w:keepLines/>
       </w:pPr>
       <w:r>
         <w:rPr>
@@ -3372,6 +3490,8 @@
       <w:pPr>
         <w:pStyle w:val="Heading1"/>
         <w:spacing w:after="160" w:before="360"/>
+        <w:keepNext/>
+        <w:keepLines/>
       </w:pPr>
       <w:r>
         <w:rPr>
@@ -3389,6 +3509,8 @@
       <w:pPr>
         <w:pStyle w:val="Heading2"/>
         <w:spacing w:after="120" w:before="280"/>
+        <w:keepNext/>
+        <w:keepLines/>
       </w:pPr>
       <w:r>
         <w:rPr>
@@ -3420,6 +3542,8 @@
       <w:pPr>
         <w:pStyle w:val="Heading2"/>
         <w:spacing w:after="120" w:before="280"/>
+        <w:keepNext/>
+        <w:keepLines/>
       </w:pPr>
       <w:r>
         <w:rPr>
@@ -3451,6 +3575,8 @@
       <w:pPr>
         <w:pStyle w:val="Heading1"/>
         <w:spacing w:after="160" w:before="360"/>
+        <w:keepNext/>
+        <w:keepLines/>
       </w:pPr>
       <w:r>
         <w:rPr>
@@ -3562,6 +3688,8 @@
       <w:pPr>
         <w:pStyle w:val="Heading1"/>
         <w:spacing w:after="160" w:before="360"/>
+        <w:keepNext/>
+        <w:keepLines/>
       </w:pPr>
       <w:r>
         <w:rPr>
@@ -3593,6 +3721,8 @@
       <w:pPr>
         <w:pStyle w:val="Heading1"/>
         <w:spacing w:after="160" w:before="360"/>
+        <w:keepNext/>
+        <w:keepLines/>
       </w:pPr>
       <w:r>
         <w:rPr>
@@ -3638,6 +3768,8 @@
       <w:pPr>
         <w:pStyle w:val="Heading1"/>
         <w:spacing w:after="160" w:before="360"/>
+        <w:keepNext/>
+        <w:keepLines/>
       </w:pPr>
       <w:r>
         <w:rPr>
@@ -3669,6 +3801,8 @@
       <w:pPr>
         <w:pStyle w:val="Heading1"/>
         <w:spacing w:after="160" w:before="360"/>
+        <w:keepNext/>
+        <w:keepLines/>
       </w:pPr>
       <w:r>
         <w:rPr>
@@ -3686,6 +3820,8 @@
       <w:pPr>
         <w:pStyle w:val="Heading2"/>
         <w:spacing w:after="120" w:before="280"/>
+        <w:keepNext/>
+        <w:keepLines/>
       </w:pPr>
       <w:r>
         <w:rPr>
@@ -3717,6 +3853,8 @@
       <w:pPr>
         <w:pStyle w:val="Heading2"/>
         <w:spacing w:after="120" w:before="280"/>
+        <w:keepNext/>
+        <w:keepLines/>
       </w:pPr>
       <w:r>
         <w:rPr>
@@ -3748,6 +3886,8 @@
       <w:pPr>
         <w:pStyle w:val="Heading2"/>
         <w:spacing w:after="120" w:before="280"/>
+        <w:keepNext/>
+        <w:keepLines/>
       </w:pPr>
       <w:r>
         <w:rPr>
@@ -3779,6 +3919,8 @@
       <w:pPr>
         <w:pStyle w:val="Heading2"/>
         <w:spacing w:after="120" w:before="280"/>
+        <w:keepNext/>
+        <w:keepLines/>
       </w:pPr>
       <w:r>
         <w:rPr>
@@ -3810,6 +3952,8 @@
       <w:pPr>
         <w:pStyle w:val="Heading2"/>
         <w:spacing w:after="120" w:before="280"/>
+        <w:keepNext/>
+        <w:keepLines/>
       </w:pPr>
       <w:r>
         <w:rPr>
@@ -3849,6 +3993,8 @@
       <w:pPr>
         <w:pStyle w:val="Heading2"/>
         <w:spacing w:after="120" w:before="280"/>
+        <w:keepNext/>
+        <w:keepLines/>
       </w:pPr>
       <w:r>
         <w:rPr>
@@ -3866,6 +4012,8 @@
       <w:pPr>
         <w:pStyle w:val="Heading2"/>
         <w:spacing w:after="120" w:before="280"/>
+        <w:keepNext/>
+        <w:keepLines/>
       </w:pPr>
       <w:r>
         <w:rPr>
@@ -3897,6 +4045,8 @@
       <w:pPr>
         <w:pStyle w:val="Heading2"/>
         <w:spacing w:after="120" w:before="280"/>
+        <w:keepNext/>
+        <w:keepLines/>
       </w:pPr>
       <w:r>
         <w:rPr>
@@ -3931,6 +4081,8 @@
     </w:p>
     <w:p>
       <w:pPr>
+        <w:keepNext/>
+        <w:keepLines/>
         <w:spacing w:after="240" w:before="1440"/>
         <w:jc w:val="center"/>
       </w:pPr>
@@ -3948,6 +4100,8 @@
     </w:p>
     <w:p>
       <w:pPr>
+        <w:keepNext/>
+        <w:keepLines/>
         <w:spacing w:after="200"/>
         <w:jc w:val="center"/>
       </w:pPr>
@@ -4061,6 +4215,8 @@
       <w:pPr>
         <w:pStyle w:val="Heading1"/>
         <w:spacing w:after="160" w:before="360"/>
+        <w:keepNext/>
+        <w:keepLines/>
       </w:pPr>
       <w:r>
         <w:rPr>
@@ -4078,6 +4234,8 @@
       <w:pPr>
         <w:pStyle w:val="Heading2"/>
         <w:spacing w:after="120" w:before="280"/>
+        <w:keepNext/>
+        <w:keepLines/>
       </w:pPr>
       <w:r>
         <w:rPr>
@@ -4120,6 +4278,8 @@
       <w:pPr>
         <w:pStyle w:val="Heading2"/>
         <w:spacing w:after="120" w:before="280"/>
+        <w:keepNext/>
+        <w:keepLines/>
       </w:pPr>
       <w:r>
         <w:rPr>
@@ -4213,6 +4373,8 @@
       <w:pPr>
         <w:pStyle w:val="Heading2"/>
         <w:spacing w:after="120" w:before="280"/>
+        <w:keepNext/>
+        <w:keepLines/>
       </w:pPr>
       <w:r>
         <w:rPr>
@@ -4325,6 +4487,8 @@
       <w:pPr>
         <w:pStyle w:val="Heading2"/>
         <w:spacing w:after="120" w:before="280"/>
+        <w:keepNext/>
+        <w:keepLines/>
       </w:pPr>
       <w:r>
         <w:rPr>
@@ -4471,6 +4635,8 @@
       <w:pPr>
         <w:pStyle w:val="Heading2"/>
         <w:spacing w:after="120" w:before="280"/>
+        <w:keepNext/>
+        <w:keepLines/>
       </w:pPr>
       <w:r>
         <w:rPr>
@@ -4502,6 +4668,8 @@
       <w:pPr>
         <w:pStyle w:val="Heading2"/>
         <w:spacing w:after="120" w:before="280"/>
+        <w:keepNext/>
+        <w:keepLines/>
       </w:pPr>
       <w:r>
         <w:rPr>
@@ -4547,6 +4715,8 @@
       <w:pPr>
         <w:pStyle w:val="Heading2"/>
         <w:spacing w:after="120" w:before="280"/>
+        <w:keepNext/>
+        <w:keepLines/>
       </w:pPr>
       <w:r>
         <w:rPr>
@@ -4578,6 +4748,8 @@
       <w:pPr>
         <w:pStyle w:val="Heading2"/>
         <w:spacing w:after="120" w:before="280"/>
+        <w:keepNext/>
+        <w:keepLines/>
       </w:pPr>
       <w:r>
         <w:rPr>
@@ -4623,6 +4795,8 @@
       <w:pPr>
         <w:pStyle w:val="Heading2"/>
         <w:spacing w:after="120" w:before="280"/>
+        <w:keepNext/>
+        <w:keepLines/>
       </w:pPr>
       <w:r>
         <w:rPr>
@@ -4659,6 +4833,8 @@
       <w:pPr>
         <w:pStyle w:val="Heading1"/>
         <w:spacing w:after="160" w:before="360"/>
+        <w:keepNext/>
+        <w:keepLines/>
       </w:pPr>
       <w:r>
         <w:rPr>
@@ -4676,6 +4852,8 @@
       <w:pPr>
         <w:pStyle w:val="Heading2"/>
         <w:spacing w:after="120" w:before="280"/>
+        <w:keepNext/>
+        <w:keepLines/>
       </w:pPr>
       <w:r>
         <w:rPr>
@@ -4718,6 +4896,8 @@
       <w:pPr>
         <w:pStyle w:val="Heading2"/>
         <w:spacing w:after="120" w:before="280"/>
+        <w:keepNext/>
+        <w:keepLines/>
       </w:pPr>
       <w:r>
         <w:rPr>
@@ -4754,6 +4934,8 @@
       <w:pPr>
         <w:pStyle w:val="Heading2"/>
         <w:spacing w:after="120" w:before="280"/>
+        <w:keepNext/>
+        <w:keepLines/>
       </w:pPr>
       <w:r>
         <w:rPr>
@@ -4904,6 +5086,8 @@
       <w:pPr>
         <w:pStyle w:val="Heading2"/>
         <w:spacing w:after="120" w:before="280"/>
+        <w:keepNext/>
+        <w:keepLines/>
       </w:pPr>
       <w:r>
         <w:rPr>
@@ -4935,6 +5119,8 @@
       <w:pPr>
         <w:pStyle w:val="Heading2"/>
         <w:spacing w:after="120" w:before="280"/>
+        <w:keepNext/>
+        <w:keepLines/>
       </w:pPr>
       <w:r>
         <w:rPr>
@@ -4966,6 +5152,8 @@
       <w:pPr>
         <w:pStyle w:val="Heading2"/>
         <w:spacing w:after="120" w:before="280"/>
+        <w:keepNext/>
+        <w:keepLines/>
       </w:pPr>
       <w:r>
         <w:rPr>
@@ -4997,6 +5185,8 @@
       <w:pPr>
         <w:pStyle w:val="Heading2"/>
         <w:spacing w:after="120" w:before="280"/>
+        <w:keepNext/>
+        <w:keepLines/>
       </w:pPr>
       <w:r>
         <w:rPr>
@@ -5042,6 +5232,8 @@
       <w:pPr>
         <w:pStyle w:val="Heading2"/>
         <w:spacing w:after="120" w:before="280"/>
+        <w:keepNext/>
+        <w:keepLines/>
       </w:pPr>
       <w:r>
         <w:rPr>
@@ -5376,6 +5568,10 @@
   </w:style>
   <w:style w:type="paragraph" w:styleId="Heading1">
     <w:name w:val="Heading 1"/>
+    <w:pPr>
+      <w:keepNext/>
+      <w:keepLines/>
+    </w:pPr>
     <w:basedOn w:val="Normal"/>
     <w:next w:val="Normal"/>
     <w:qFormat/>
@@ -5387,6 +5583,10 @@
   </w:style>
   <w:style w:type="paragraph" w:styleId="Heading2">
     <w:name w:val="Heading 2"/>
+    <w:pPr>
+      <w:keepNext/>
+      <w:keepLines/>
+    </w:pPr>
     <w:basedOn w:val="Normal"/>
     <w:next w:val="Normal"/>
     <w:qFormat/>
@@ -5398,6 +5598,10 @@
   </w:style>
   <w:style w:type="paragraph" w:styleId="Heading3">
     <w:name w:val="Heading 3"/>
+    <w:pPr>
+      <w:keepNext/>
+      <w:keepLines/>
+    </w:pPr>
     <w:basedOn w:val="Normal"/>
     <w:next w:val="Normal"/>
     <w:qFormat/>

</xml_diff>

<commit_message>
Fix orphaned headings: proper Word heading styles with keepNext/keepLines
- Changed all heading functions to use HeadingLevel.HEADING_1/2/3 instead of inline formatting
- Added keepNext and keepLines properties to prevent headings from appearing at page bottom without body text
- Defined paragraph styles in Document constructor for all 9 documents
- Reduced heading before-spacing from 360 to 240 DXA for tighter layout
- All 9 documents rebuilt and visually verified: no orphaned headings remain
</commit_message>
<xml_diff>
--- a/revised-april-2026/BWP_ADV_Part_2A___2B(v.04.2026).docx
+++ b/revised-april-2026/BWP_ADV_Part_2A___2B(v.04.2026).docx
@@ -4,8 +4,6 @@
   <w:body>
     <w:p>
       <w:pPr>
-        <w:keepNext/>
-        <w:keepLines/>
         <w:spacing w:after="240" w:before="1440"/>
         <w:jc w:val="center"/>
       </w:pPr>
@@ -23,8 +21,6 @@
     </w:p>
     <w:p>
       <w:pPr>
-        <w:keepNext/>
-        <w:keepLines/>
         <w:spacing w:after="200"/>
         <w:jc w:val="center"/>
       </w:pPr>
@@ -152,9 +148,9 @@
     <w:p>
       <w:pPr>
         <w:pStyle w:val="Heading1"/>
-        <w:spacing w:after="160" w:before="360"/>
-        <w:keepNext/>
-        <w:keepLines/>
+        <w:keepNext/>
+        <w:keepLines/>
+        <w:spacing w:after="120" w:before="240"/>
       </w:pPr>
       <w:r>
         <w:rPr>
@@ -313,9 +309,9 @@
     <w:p>
       <w:pPr>
         <w:pStyle w:val="Heading1"/>
-        <w:spacing w:after="160" w:before="360"/>
-        <w:keepNext/>
-        <w:keepLines/>
+        <w:keepNext/>
+        <w:keepLines/>
+        <w:spacing w:after="120" w:before="240"/>
       </w:pPr>
       <w:r>
         <w:rPr>
@@ -655,9 +651,9 @@
     <w:p>
       <w:pPr>
         <w:pStyle w:val="Heading1"/>
-        <w:spacing w:after="160" w:before="360"/>
-        <w:keepNext/>
-        <w:keepLines/>
+        <w:keepNext/>
+        <w:keepLines/>
+        <w:spacing w:after="120" w:before="240"/>
       </w:pPr>
       <w:r>
         <w:rPr>
@@ -674,9 +670,9 @@
     <w:p>
       <w:pPr>
         <w:pStyle w:val="Heading2"/>
-        <w:spacing w:after="120" w:before="280"/>
-        <w:keepNext/>
-        <w:keepLines/>
+        <w:keepNext/>
+        <w:keepLines/>
+        <w:spacing w:after="100" w:before="200"/>
       </w:pPr>
       <w:r>
         <w:rPr>
@@ -721,9 +717,9 @@
     <w:p>
       <w:pPr>
         <w:pStyle w:val="Heading2"/>
-        <w:spacing w:after="120" w:before="280"/>
-        <w:keepNext/>
-        <w:keepLines/>
+        <w:keepNext/>
+        <w:keepLines/>
+        <w:spacing w:after="100" w:before="200"/>
       </w:pPr>
       <w:r>
         <w:rPr>
@@ -754,9 +750,9 @@
     <w:p>
       <w:pPr>
         <w:pStyle w:val="Heading2"/>
-        <w:spacing w:after="120" w:before="280"/>
-        <w:keepNext/>
-        <w:keepLines/>
+        <w:keepNext/>
+        <w:keepLines/>
+        <w:spacing w:after="100" w:before="200"/>
       </w:pPr>
       <w:r>
         <w:rPr>
@@ -829,9 +825,9 @@
     <w:p>
       <w:pPr>
         <w:pStyle w:val="Heading2"/>
-        <w:spacing w:after="120" w:before="280"/>
-        <w:keepNext/>
-        <w:keepLines/>
+        <w:keepNext/>
+        <w:keepLines/>
+        <w:spacing w:after="100" w:before="200"/>
       </w:pPr>
       <w:r>
         <w:rPr>
@@ -862,9 +858,9 @@
     <w:p>
       <w:pPr>
         <w:pStyle w:val="Heading2"/>
-        <w:spacing w:after="120" w:before="280"/>
-        <w:keepNext/>
-        <w:keepLines/>
+        <w:keepNext/>
+        <w:keepLines/>
+        <w:spacing w:after="100" w:before="200"/>
       </w:pPr>
       <w:r>
         <w:rPr>
@@ -909,9 +905,9 @@
     <w:p>
       <w:pPr>
         <w:pStyle w:val="Heading2"/>
-        <w:spacing w:after="120" w:before="280"/>
-        <w:keepNext/>
-        <w:keepLines/>
+        <w:keepNext/>
+        <w:keepLines/>
+        <w:spacing w:after="100" w:before="200"/>
       </w:pPr>
       <w:r>
         <w:rPr>
@@ -942,9 +938,9 @@
     <w:p>
       <w:pPr>
         <w:pStyle w:val="Heading2"/>
-        <w:spacing w:after="120" w:before="280"/>
-        <w:keepNext/>
-        <w:keepLines/>
+        <w:keepNext/>
+        <w:keepLines/>
+        <w:spacing w:after="100" w:before="200"/>
       </w:pPr>
       <w:r>
         <w:rPr>
@@ -975,9 +971,9 @@
     <w:p>
       <w:pPr>
         <w:pStyle w:val="Heading2"/>
-        <w:spacing w:after="120" w:before="280"/>
-        <w:keepNext/>
-        <w:keepLines/>
+        <w:keepNext/>
+        <w:keepLines/>
+        <w:spacing w:after="100" w:before="200"/>
       </w:pPr>
       <w:r>
         <w:rPr>
@@ -1008,9 +1004,9 @@
     <w:p>
       <w:pPr>
         <w:pStyle w:val="Heading2"/>
-        <w:spacing w:after="120" w:before="280"/>
-        <w:keepNext/>
-        <w:keepLines/>
+        <w:keepNext/>
+        <w:keepLines/>
+        <w:spacing w:after="100" w:before="200"/>
       </w:pPr>
       <w:r>
         <w:rPr>
@@ -1041,9 +1037,9 @@
     <w:p>
       <w:pPr>
         <w:pStyle w:val="Heading2"/>
-        <w:spacing w:after="120" w:before="280"/>
-        <w:keepNext/>
-        <w:keepLines/>
+        <w:keepNext/>
+        <w:keepLines/>
+        <w:spacing w:after="100" w:before="200"/>
       </w:pPr>
       <w:r>
         <w:rPr>
@@ -1074,9 +1070,9 @@
     <w:p>
       <w:pPr>
         <w:pStyle w:val="Heading2"/>
-        <w:spacing w:after="120" w:before="280"/>
-        <w:keepNext/>
-        <w:keepLines/>
+        <w:keepNext/>
+        <w:keepLines/>
+        <w:spacing w:after="100" w:before="200"/>
       </w:pPr>
       <w:r>
         <w:rPr>
@@ -1107,9 +1103,9 @@
     <w:p>
       <w:pPr>
         <w:pStyle w:val="Heading2"/>
-        <w:spacing w:after="120" w:before="280"/>
-        <w:keepNext/>
-        <w:keepLines/>
+        <w:keepNext/>
+        <w:keepLines/>
+        <w:spacing w:after="100" w:before="200"/>
       </w:pPr>
       <w:r>
         <w:rPr>
@@ -1140,9 +1136,9 @@
     <w:p>
       <w:pPr>
         <w:pStyle w:val="Heading2"/>
-        <w:spacing w:after="120" w:before="280"/>
-        <w:keepNext/>
-        <w:keepLines/>
+        <w:keepNext/>
+        <w:keepLines/>
+        <w:spacing w:after="100" w:before="200"/>
       </w:pPr>
       <w:r>
         <w:rPr>
@@ -1173,9 +1169,9 @@
     <w:p>
       <w:pPr>
         <w:pStyle w:val="Heading1"/>
-        <w:spacing w:after="160" w:before="360"/>
-        <w:keepNext/>
-        <w:keepLines/>
+        <w:keepNext/>
+        <w:keepLines/>
+        <w:spacing w:after="120" w:before="240"/>
       </w:pPr>
       <w:r>
         <w:rPr>
@@ -1220,9 +1216,9 @@
     <w:p>
       <w:pPr>
         <w:pStyle w:val="Heading2"/>
-        <w:spacing w:after="120" w:before="280"/>
-        <w:keepNext/>
-        <w:keepLines/>
+        <w:keepNext/>
+        <w:keepLines/>
+        <w:spacing w:after="100" w:before="200"/>
       </w:pPr>
       <w:r>
         <w:rPr>
@@ -1542,9 +1538,9 @@
     <w:p>
       <w:pPr>
         <w:pStyle w:val="Heading2"/>
-        <w:spacing w:after="120" w:before="280"/>
-        <w:keepNext/>
-        <w:keepLines/>
+        <w:keepNext/>
+        <w:keepLines/>
+        <w:spacing w:after="100" w:before="200"/>
       </w:pPr>
       <w:r>
         <w:rPr>
@@ -1589,9 +1585,9 @@
     <w:p>
       <w:pPr>
         <w:pStyle w:val="Heading2"/>
-        <w:spacing w:after="120" w:before="280"/>
-        <w:keepNext/>
-        <w:keepLines/>
+        <w:keepNext/>
+        <w:keepLines/>
+        <w:spacing w:after="100" w:before="200"/>
       </w:pPr>
       <w:r>
         <w:rPr>
@@ -1622,9 +1618,9 @@
     <w:p>
       <w:pPr>
         <w:pStyle w:val="Heading2"/>
-        <w:spacing w:after="120" w:before="280"/>
-        <w:keepNext/>
-        <w:keepLines/>
+        <w:keepNext/>
+        <w:keepLines/>
+        <w:spacing w:after="100" w:before="200"/>
       </w:pPr>
       <w:r>
         <w:rPr>
@@ -1930,9 +1926,9 @@
     <w:p>
       <w:pPr>
         <w:pStyle w:val="Heading2"/>
-        <w:spacing w:after="120" w:before="280"/>
-        <w:keepNext/>
-        <w:keepLines/>
+        <w:keepNext/>
+        <w:keepLines/>
+        <w:spacing w:after="100" w:before="200"/>
       </w:pPr>
       <w:r>
         <w:rPr>
@@ -1963,9 +1959,9 @@
     <w:p>
       <w:pPr>
         <w:pStyle w:val="Heading2"/>
-        <w:spacing w:after="120" w:before="280"/>
-        <w:keepNext/>
-        <w:keepLines/>
+        <w:keepNext/>
+        <w:keepLines/>
+        <w:spacing w:after="100" w:before="200"/>
       </w:pPr>
       <w:r>
         <w:rPr>
@@ -2038,9 +2034,9 @@
     <w:p>
       <w:pPr>
         <w:pStyle w:val="Heading2"/>
-        <w:spacing w:after="120" w:before="280"/>
-        <w:keepNext/>
-        <w:keepLines/>
+        <w:keepNext/>
+        <w:keepLines/>
+        <w:spacing w:after="100" w:before="200"/>
       </w:pPr>
       <w:r>
         <w:rPr>
@@ -2071,9 +2067,9 @@
     <w:p>
       <w:pPr>
         <w:pStyle w:val="Heading2"/>
-        <w:spacing w:after="120" w:before="280"/>
-        <w:keepNext/>
-        <w:keepLines/>
+        <w:keepNext/>
+        <w:keepLines/>
+        <w:spacing w:after="100" w:before="200"/>
       </w:pPr>
       <w:r>
         <w:rPr>
@@ -2132,9 +2128,9 @@
     <w:p>
       <w:pPr>
         <w:pStyle w:val="Heading2"/>
-        <w:spacing w:after="120" w:before="280"/>
-        <w:keepNext/>
-        <w:keepLines/>
+        <w:keepNext/>
+        <w:keepLines/>
+        <w:spacing w:after="100" w:before="200"/>
       </w:pPr>
       <w:r>
         <w:rPr>
@@ -2165,9 +2161,9 @@
     <w:p>
       <w:pPr>
         <w:pStyle w:val="Heading1"/>
-        <w:spacing w:after="160" w:before="360"/>
-        <w:keepNext/>
-        <w:keepLines/>
+        <w:keepNext/>
+        <w:keepLines/>
+        <w:spacing w:after="120" w:before="240"/>
       </w:pPr>
       <w:r>
         <w:rPr>
@@ -2198,9 +2194,9 @@
     <w:p>
       <w:pPr>
         <w:pStyle w:val="Heading1"/>
-        <w:spacing w:after="160" w:before="360"/>
-        <w:keepNext/>
-        <w:keepLines/>
+        <w:keepNext/>
+        <w:keepLines/>
+        <w:spacing w:after="120" w:before="240"/>
       </w:pPr>
       <w:r>
         <w:rPr>
@@ -2245,9 +2241,9 @@
     <w:p>
       <w:pPr>
         <w:pStyle w:val="Heading1"/>
-        <w:spacing w:after="160" w:before="360"/>
-        <w:keepNext/>
-        <w:keepLines/>
+        <w:keepNext/>
+        <w:keepLines/>
+        <w:spacing w:after="120" w:before="240"/>
       </w:pPr>
       <w:r>
         <w:rPr>
@@ -2278,9 +2274,9 @@
     <w:p>
       <w:pPr>
         <w:pStyle w:val="Heading2"/>
-        <w:spacing w:after="120" w:before="280"/>
-        <w:keepNext/>
-        <w:keepLines/>
+        <w:keepNext/>
+        <w:keepLines/>
+        <w:spacing w:after="100" w:before="200"/>
       </w:pPr>
       <w:r>
         <w:rPr>
@@ -2395,9 +2391,9 @@
     <w:p>
       <w:pPr>
         <w:pStyle w:val="Heading2"/>
-        <w:spacing w:after="120" w:before="280"/>
-        <w:keepNext/>
-        <w:keepLines/>
+        <w:keepNext/>
+        <w:keepLines/>
+        <w:spacing w:after="100" w:before="200"/>
       </w:pPr>
       <w:r>
         <w:rPr>
@@ -2484,9 +2480,9 @@
     <w:p>
       <w:pPr>
         <w:pStyle w:val="Heading2"/>
-        <w:spacing w:after="120" w:before="280"/>
-        <w:keepNext/>
-        <w:keepLines/>
+        <w:keepNext/>
+        <w:keepLines/>
+        <w:spacing w:after="100" w:before="200"/>
       </w:pPr>
       <w:r>
         <w:rPr>
@@ -2531,9 +2527,9 @@
     <w:p>
       <w:pPr>
         <w:pStyle w:val="Heading1"/>
-        <w:spacing w:after="160" w:before="360"/>
-        <w:keepNext/>
-        <w:keepLines/>
+        <w:keepNext/>
+        <w:keepLines/>
+        <w:spacing w:after="120" w:before="240"/>
       </w:pPr>
       <w:r>
         <w:rPr>
@@ -2550,9 +2546,9 @@
     <w:p>
       <w:pPr>
         <w:pStyle w:val="Heading2"/>
-        <w:spacing w:after="120" w:before="280"/>
-        <w:keepNext/>
-        <w:keepLines/>
+        <w:keepNext/>
+        <w:keepLines/>
+        <w:spacing w:after="100" w:before="200"/>
       </w:pPr>
       <w:r>
         <w:rPr>
@@ -2583,9 +2579,9 @@
     <w:p>
       <w:pPr>
         <w:pStyle w:val="Heading2"/>
-        <w:spacing w:after="120" w:before="280"/>
-        <w:keepNext/>
-        <w:keepLines/>
+        <w:keepNext/>
+        <w:keepLines/>
+        <w:spacing w:after="100" w:before="200"/>
       </w:pPr>
       <w:r>
         <w:rPr>
@@ -2616,9 +2612,9 @@
     <w:p>
       <w:pPr>
         <w:pStyle w:val="Heading2"/>
-        <w:spacing w:after="120" w:before="280"/>
-        <w:keepNext/>
-        <w:keepLines/>
+        <w:keepNext/>
+        <w:keepLines/>
+        <w:spacing w:after="100" w:before="200"/>
       </w:pPr>
       <w:r>
         <w:rPr>
@@ -2649,9 +2645,9 @@
     <w:p>
       <w:pPr>
         <w:pStyle w:val="Heading1"/>
-        <w:spacing w:after="160" w:before="360"/>
-        <w:keepNext/>
-        <w:keepLines/>
+        <w:keepNext/>
+        <w:keepLines/>
+        <w:spacing w:after="120" w:before="240"/>
       </w:pPr>
       <w:r>
         <w:rPr>
@@ -2668,9 +2664,9 @@
     <w:p>
       <w:pPr>
         <w:pStyle w:val="Heading2"/>
-        <w:spacing w:after="120" w:before="280"/>
-        <w:keepNext/>
-        <w:keepLines/>
+        <w:keepNext/>
+        <w:keepLines/>
+        <w:spacing w:after="100" w:before="200"/>
       </w:pPr>
       <w:r>
         <w:rPr>
@@ -2701,9 +2697,9 @@
     <w:p>
       <w:pPr>
         <w:pStyle w:val="Heading2"/>
-        <w:spacing w:after="120" w:before="280"/>
-        <w:keepNext/>
-        <w:keepLines/>
+        <w:keepNext/>
+        <w:keepLines/>
+        <w:spacing w:after="100" w:before="200"/>
       </w:pPr>
       <w:r>
         <w:rPr>
@@ -2734,9 +2730,9 @@
     <w:p>
       <w:pPr>
         <w:pStyle w:val="Heading2"/>
-        <w:spacing w:after="120" w:before="280"/>
-        <w:keepNext/>
-        <w:keepLines/>
+        <w:keepNext/>
+        <w:keepLines/>
+        <w:spacing w:after="100" w:before="200"/>
       </w:pPr>
       <w:r>
         <w:rPr>
@@ -2781,9 +2777,9 @@
     <w:p>
       <w:pPr>
         <w:pStyle w:val="Heading2"/>
-        <w:spacing w:after="120" w:before="280"/>
-        <w:keepNext/>
-        <w:keepLines/>
+        <w:keepNext/>
+        <w:keepLines/>
+        <w:spacing w:after="100" w:before="200"/>
       </w:pPr>
       <w:r>
         <w:rPr>
@@ -2814,9 +2810,9 @@
     <w:p>
       <w:pPr>
         <w:pStyle w:val="Heading1"/>
-        <w:spacing w:after="160" w:before="360"/>
-        <w:keepNext/>
-        <w:keepLines/>
+        <w:keepNext/>
+        <w:keepLines/>
+        <w:spacing w:after="120" w:before="240"/>
       </w:pPr>
       <w:r>
         <w:rPr>
@@ -2847,9 +2843,9 @@
     <w:p>
       <w:pPr>
         <w:pStyle w:val="Heading2"/>
-        <w:spacing w:after="120" w:before="280"/>
-        <w:keepNext/>
-        <w:keepLines/>
+        <w:keepNext/>
+        <w:keepLines/>
+        <w:spacing w:after="100" w:before="200"/>
       </w:pPr>
       <w:r>
         <w:rPr>
@@ -3027,9 +3023,9 @@
     <w:p>
       <w:pPr>
         <w:pStyle w:val="Heading2"/>
-        <w:spacing w:after="120" w:before="280"/>
-        <w:keepNext/>
-        <w:keepLines/>
+        <w:keepNext/>
+        <w:keepLines/>
+        <w:spacing w:after="100" w:before="200"/>
       </w:pPr>
       <w:r>
         <w:rPr>
@@ -3060,9 +3056,9 @@
     <w:p>
       <w:pPr>
         <w:pStyle w:val="Heading2"/>
-        <w:spacing w:after="120" w:before="280"/>
-        <w:keepNext/>
-        <w:keepLines/>
+        <w:keepNext/>
+        <w:keepLines/>
+        <w:spacing w:after="100" w:before="200"/>
       </w:pPr>
       <w:r>
         <w:rPr>
@@ -3093,9 +3089,9 @@
     <w:p>
       <w:pPr>
         <w:pStyle w:val="Heading2"/>
-        <w:spacing w:after="120" w:before="280"/>
-        <w:keepNext/>
-        <w:keepLines/>
+        <w:keepNext/>
+        <w:keepLines/>
+        <w:spacing w:after="100" w:before="200"/>
       </w:pPr>
       <w:r>
         <w:rPr>
@@ -3126,9 +3122,9 @@
     <w:p>
       <w:pPr>
         <w:pStyle w:val="Heading1"/>
-        <w:spacing w:after="160" w:before="360"/>
-        <w:keepNext/>
-        <w:keepLines/>
+        <w:keepNext/>
+        <w:keepLines/>
+        <w:spacing w:after="120" w:before="240"/>
       </w:pPr>
       <w:r>
         <w:rPr>
@@ -3145,9 +3141,9 @@
     <w:p>
       <w:pPr>
         <w:pStyle w:val="Heading2"/>
-        <w:spacing w:after="120" w:before="280"/>
-        <w:keepNext/>
-        <w:keepLines/>
+        <w:keepNext/>
+        <w:keepLines/>
+        <w:spacing w:after="100" w:before="200"/>
       </w:pPr>
       <w:r>
         <w:rPr>
@@ -3206,9 +3202,9 @@
     <w:p>
       <w:pPr>
         <w:pStyle w:val="Heading2"/>
-        <w:spacing w:after="120" w:before="280"/>
-        <w:keepNext/>
-        <w:keepLines/>
+        <w:keepNext/>
+        <w:keepLines/>
+        <w:spacing w:after="100" w:before="200"/>
       </w:pPr>
       <w:r>
         <w:rPr>
@@ -3239,9 +3235,9 @@
     <w:p>
       <w:pPr>
         <w:pStyle w:val="Heading2"/>
-        <w:spacing w:after="120" w:before="280"/>
-        <w:keepNext/>
-        <w:keepLines/>
+        <w:keepNext/>
+        <w:keepLines/>
+        <w:spacing w:after="100" w:before="200"/>
       </w:pPr>
       <w:r>
         <w:rPr>
@@ -3272,9 +3268,9 @@
     <w:p>
       <w:pPr>
         <w:pStyle w:val="Heading2"/>
-        <w:spacing w:after="120" w:before="280"/>
-        <w:keepNext/>
-        <w:keepLines/>
+        <w:keepNext/>
+        <w:keepLines/>
+        <w:spacing w:after="100" w:before="200"/>
       </w:pPr>
       <w:r>
         <w:rPr>
@@ -3305,9 +3301,9 @@
     <w:p>
       <w:pPr>
         <w:pStyle w:val="Heading2"/>
-        <w:spacing w:after="120" w:before="280"/>
-        <w:keepNext/>
-        <w:keepLines/>
+        <w:keepNext/>
+        <w:keepLines/>
+        <w:spacing w:after="100" w:before="200"/>
       </w:pPr>
       <w:r>
         <w:rPr>
@@ -3338,9 +3334,9 @@
     <w:p>
       <w:pPr>
         <w:pStyle w:val="Heading1"/>
-        <w:spacing w:after="160" w:before="360"/>
-        <w:keepNext/>
-        <w:keepLines/>
+        <w:keepNext/>
+        <w:keepLines/>
+        <w:spacing w:after="120" w:before="240"/>
       </w:pPr>
       <w:r>
         <w:rPr>
@@ -3357,9 +3353,9 @@
     <w:p>
       <w:pPr>
         <w:pStyle w:val="Heading2"/>
-        <w:spacing w:after="120" w:before="280"/>
-        <w:keepNext/>
-        <w:keepLines/>
+        <w:keepNext/>
+        <w:keepLines/>
+        <w:spacing w:after="100" w:before="200"/>
       </w:pPr>
       <w:r>
         <w:rPr>
@@ -3390,9 +3386,9 @@
     <w:p>
       <w:pPr>
         <w:pStyle w:val="Heading2"/>
-        <w:spacing w:after="120" w:before="280"/>
-        <w:keepNext/>
-        <w:keepLines/>
+        <w:keepNext/>
+        <w:keepLines/>
+        <w:spacing w:after="100" w:before="200"/>
       </w:pPr>
       <w:r>
         <w:rPr>
@@ -3423,9 +3419,9 @@
     <w:p>
       <w:pPr>
         <w:pStyle w:val="Heading2"/>
-        <w:spacing w:after="120" w:before="280"/>
-        <w:keepNext/>
-        <w:keepLines/>
+        <w:keepNext/>
+        <w:keepLines/>
+        <w:spacing w:after="100" w:before="200"/>
       </w:pPr>
       <w:r>
         <w:rPr>
@@ -3456,9 +3452,9 @@
     <w:p>
       <w:pPr>
         <w:pStyle w:val="Heading2"/>
-        <w:spacing w:after="120" w:before="280"/>
-        <w:keepNext/>
-        <w:keepLines/>
+        <w:keepNext/>
+        <w:keepLines/>
+        <w:spacing w:after="100" w:before="200"/>
       </w:pPr>
       <w:r>
         <w:rPr>
@@ -3489,9 +3485,9 @@
     <w:p>
       <w:pPr>
         <w:pStyle w:val="Heading1"/>
-        <w:spacing w:after="160" w:before="360"/>
-        <w:keepNext/>
-        <w:keepLines/>
+        <w:keepNext/>
+        <w:keepLines/>
+        <w:spacing w:after="120" w:before="240"/>
       </w:pPr>
       <w:r>
         <w:rPr>
@@ -3508,9 +3504,9 @@
     <w:p>
       <w:pPr>
         <w:pStyle w:val="Heading2"/>
-        <w:spacing w:after="120" w:before="280"/>
-        <w:keepNext/>
-        <w:keepLines/>
+        <w:keepNext/>
+        <w:keepLines/>
+        <w:spacing w:after="100" w:before="200"/>
       </w:pPr>
       <w:r>
         <w:rPr>
@@ -3541,9 +3537,9 @@
     <w:p>
       <w:pPr>
         <w:pStyle w:val="Heading2"/>
-        <w:spacing w:after="120" w:before="280"/>
-        <w:keepNext/>
-        <w:keepLines/>
+        <w:keepNext/>
+        <w:keepLines/>
+        <w:spacing w:after="100" w:before="200"/>
       </w:pPr>
       <w:r>
         <w:rPr>
@@ -3574,9 +3570,9 @@
     <w:p>
       <w:pPr>
         <w:pStyle w:val="Heading1"/>
-        <w:spacing w:after="160" w:before="360"/>
-        <w:keepNext/>
-        <w:keepLines/>
+        <w:keepNext/>
+        <w:keepLines/>
+        <w:spacing w:after="120" w:before="240"/>
       </w:pPr>
       <w:r>
         <w:rPr>
@@ -3687,9 +3683,9 @@
     <w:p>
       <w:pPr>
         <w:pStyle w:val="Heading1"/>
-        <w:spacing w:after="160" w:before="360"/>
-        <w:keepNext/>
-        <w:keepLines/>
+        <w:keepNext/>
+        <w:keepLines/>
+        <w:spacing w:after="120" w:before="240"/>
       </w:pPr>
       <w:r>
         <w:rPr>
@@ -3720,9 +3716,9 @@
     <w:p>
       <w:pPr>
         <w:pStyle w:val="Heading1"/>
-        <w:spacing w:after="160" w:before="360"/>
-        <w:keepNext/>
-        <w:keepLines/>
+        <w:keepNext/>
+        <w:keepLines/>
+        <w:spacing w:after="120" w:before="240"/>
       </w:pPr>
       <w:r>
         <w:rPr>
@@ -3767,9 +3763,9 @@
     <w:p>
       <w:pPr>
         <w:pStyle w:val="Heading1"/>
-        <w:spacing w:after="160" w:before="360"/>
-        <w:keepNext/>
-        <w:keepLines/>
+        <w:keepNext/>
+        <w:keepLines/>
+        <w:spacing w:after="120" w:before="240"/>
       </w:pPr>
       <w:r>
         <w:rPr>
@@ -3800,9 +3796,9 @@
     <w:p>
       <w:pPr>
         <w:pStyle w:val="Heading1"/>
-        <w:spacing w:after="160" w:before="360"/>
-        <w:keepNext/>
-        <w:keepLines/>
+        <w:keepNext/>
+        <w:keepLines/>
+        <w:spacing w:after="120" w:before="240"/>
       </w:pPr>
       <w:r>
         <w:rPr>
@@ -3819,9 +3815,9 @@
     <w:p>
       <w:pPr>
         <w:pStyle w:val="Heading2"/>
-        <w:spacing w:after="120" w:before="280"/>
-        <w:keepNext/>
-        <w:keepLines/>
+        <w:keepNext/>
+        <w:keepLines/>
+        <w:spacing w:after="100" w:before="200"/>
       </w:pPr>
       <w:r>
         <w:rPr>
@@ -3852,9 +3848,9 @@
     <w:p>
       <w:pPr>
         <w:pStyle w:val="Heading2"/>
-        <w:spacing w:after="120" w:before="280"/>
-        <w:keepNext/>
-        <w:keepLines/>
+        <w:keepNext/>
+        <w:keepLines/>
+        <w:spacing w:after="100" w:before="200"/>
       </w:pPr>
       <w:r>
         <w:rPr>
@@ -3885,9 +3881,9 @@
     <w:p>
       <w:pPr>
         <w:pStyle w:val="Heading2"/>
-        <w:spacing w:after="120" w:before="280"/>
-        <w:keepNext/>
-        <w:keepLines/>
+        <w:keepNext/>
+        <w:keepLines/>
+        <w:spacing w:after="100" w:before="200"/>
       </w:pPr>
       <w:r>
         <w:rPr>
@@ -3918,9 +3914,9 @@
     <w:p>
       <w:pPr>
         <w:pStyle w:val="Heading2"/>
-        <w:spacing w:after="120" w:before="280"/>
-        <w:keepNext/>
-        <w:keepLines/>
+        <w:keepNext/>
+        <w:keepLines/>
+        <w:spacing w:after="100" w:before="200"/>
       </w:pPr>
       <w:r>
         <w:rPr>
@@ -3951,9 +3947,9 @@
     <w:p>
       <w:pPr>
         <w:pStyle w:val="Heading2"/>
-        <w:spacing w:after="120" w:before="280"/>
-        <w:keepNext/>
-        <w:keepLines/>
+        <w:keepNext/>
+        <w:keepLines/>
+        <w:spacing w:after="100" w:before="200"/>
       </w:pPr>
       <w:r>
         <w:rPr>
@@ -3992,9 +3988,9 @@
     <w:p>
       <w:pPr>
         <w:pStyle w:val="Heading2"/>
-        <w:spacing w:after="120" w:before="280"/>
-        <w:keepNext/>
-        <w:keepLines/>
+        <w:keepNext/>
+        <w:keepLines/>
+        <w:spacing w:after="100" w:before="200"/>
       </w:pPr>
       <w:r>
         <w:rPr>
@@ -4011,9 +4007,9 @@
     <w:p>
       <w:pPr>
         <w:pStyle w:val="Heading2"/>
-        <w:spacing w:after="120" w:before="280"/>
-        <w:keepNext/>
-        <w:keepLines/>
+        <w:keepNext/>
+        <w:keepLines/>
+        <w:spacing w:after="100" w:before="200"/>
       </w:pPr>
       <w:r>
         <w:rPr>
@@ -4044,9 +4040,9 @@
     <w:p>
       <w:pPr>
         <w:pStyle w:val="Heading2"/>
-        <w:spacing w:after="120" w:before="280"/>
-        <w:keepNext/>
-        <w:keepLines/>
+        <w:keepNext/>
+        <w:keepLines/>
+        <w:spacing w:after="100" w:before="200"/>
       </w:pPr>
       <w:r>
         <w:rPr>
@@ -4081,8 +4077,6 @@
     </w:p>
     <w:p>
       <w:pPr>
-        <w:keepNext/>
-        <w:keepLines/>
         <w:spacing w:after="240" w:before="1440"/>
         <w:jc w:val="center"/>
       </w:pPr>
@@ -4100,8 +4094,6 @@
     </w:p>
     <w:p>
       <w:pPr>
-        <w:keepNext/>
-        <w:keepLines/>
         <w:spacing w:after="200"/>
         <w:jc w:val="center"/>
       </w:pPr>
@@ -4214,9 +4206,9 @@
     <w:p>
       <w:pPr>
         <w:pStyle w:val="Heading1"/>
-        <w:spacing w:after="160" w:before="360"/>
-        <w:keepNext/>
-        <w:keepLines/>
+        <w:keepNext/>
+        <w:keepLines/>
+        <w:spacing w:after="120" w:before="240"/>
       </w:pPr>
       <w:r>
         <w:rPr>
@@ -4233,9 +4225,9 @@
     <w:p>
       <w:pPr>
         <w:pStyle w:val="Heading2"/>
-        <w:spacing w:after="120" w:before="280"/>
-        <w:keepNext/>
-        <w:keepLines/>
+        <w:keepNext/>
+        <w:keepLines/>
+        <w:spacing w:after="100" w:before="200"/>
       </w:pPr>
       <w:r>
         <w:rPr>
@@ -4277,9 +4269,9 @@
     <w:p>
       <w:pPr>
         <w:pStyle w:val="Heading2"/>
-        <w:spacing w:after="120" w:before="280"/>
-        <w:keepNext/>
-        <w:keepLines/>
+        <w:keepNext/>
+        <w:keepLines/>
+        <w:spacing w:after="100" w:before="200"/>
       </w:pPr>
       <w:r>
         <w:rPr>
@@ -4372,9 +4364,9 @@
     <w:p>
       <w:pPr>
         <w:pStyle w:val="Heading2"/>
-        <w:spacing w:after="120" w:before="280"/>
-        <w:keepNext/>
-        <w:keepLines/>
+        <w:keepNext/>
+        <w:keepLines/>
+        <w:spacing w:after="100" w:before="200"/>
       </w:pPr>
       <w:r>
         <w:rPr>
@@ -4486,9 +4478,9 @@
     <w:p>
       <w:pPr>
         <w:pStyle w:val="Heading2"/>
-        <w:spacing w:after="120" w:before="280"/>
-        <w:keepNext/>
-        <w:keepLines/>
+        <w:keepNext/>
+        <w:keepLines/>
+        <w:spacing w:after="100" w:before="200"/>
       </w:pPr>
       <w:r>
         <w:rPr>
@@ -4634,9 +4626,9 @@
     <w:p>
       <w:pPr>
         <w:pStyle w:val="Heading2"/>
-        <w:spacing w:after="120" w:before="280"/>
-        <w:keepNext/>
-        <w:keepLines/>
+        <w:keepNext/>
+        <w:keepLines/>
+        <w:spacing w:after="100" w:before="200"/>
       </w:pPr>
       <w:r>
         <w:rPr>
@@ -4667,9 +4659,9 @@
     <w:p>
       <w:pPr>
         <w:pStyle w:val="Heading2"/>
-        <w:spacing w:after="120" w:before="280"/>
-        <w:keepNext/>
-        <w:keepLines/>
+        <w:keepNext/>
+        <w:keepLines/>
+        <w:spacing w:after="100" w:before="200"/>
       </w:pPr>
       <w:r>
         <w:rPr>
@@ -4714,9 +4706,9 @@
     <w:p>
       <w:pPr>
         <w:pStyle w:val="Heading2"/>
-        <w:spacing w:after="120" w:before="280"/>
-        <w:keepNext/>
-        <w:keepLines/>
+        <w:keepNext/>
+        <w:keepLines/>
+        <w:spacing w:after="100" w:before="200"/>
       </w:pPr>
       <w:r>
         <w:rPr>
@@ -4747,9 +4739,9 @@
     <w:p>
       <w:pPr>
         <w:pStyle w:val="Heading2"/>
-        <w:spacing w:after="120" w:before="280"/>
-        <w:keepNext/>
-        <w:keepLines/>
+        <w:keepNext/>
+        <w:keepLines/>
+        <w:spacing w:after="100" w:before="200"/>
       </w:pPr>
       <w:r>
         <w:rPr>
@@ -4794,9 +4786,9 @@
     <w:p>
       <w:pPr>
         <w:pStyle w:val="Heading2"/>
-        <w:spacing w:after="120" w:before="280"/>
-        <w:keepNext/>
-        <w:keepLines/>
+        <w:keepNext/>
+        <w:keepLines/>
+        <w:spacing w:after="100" w:before="200"/>
       </w:pPr>
       <w:r>
         <w:rPr>
@@ -4832,9 +4824,9 @@
     <w:p>
       <w:pPr>
         <w:pStyle w:val="Heading1"/>
-        <w:spacing w:after="160" w:before="360"/>
-        <w:keepNext/>
-        <w:keepLines/>
+        <w:keepNext/>
+        <w:keepLines/>
+        <w:spacing w:after="120" w:before="240"/>
       </w:pPr>
       <w:r>
         <w:rPr>
@@ -4851,9 +4843,9 @@
     <w:p>
       <w:pPr>
         <w:pStyle w:val="Heading2"/>
-        <w:spacing w:after="120" w:before="280"/>
-        <w:keepNext/>
-        <w:keepLines/>
+        <w:keepNext/>
+        <w:keepLines/>
+        <w:spacing w:after="100" w:before="200"/>
       </w:pPr>
       <w:r>
         <w:rPr>
@@ -4895,9 +4887,9 @@
     <w:p>
       <w:pPr>
         <w:pStyle w:val="Heading2"/>
-        <w:spacing w:after="120" w:before="280"/>
-        <w:keepNext/>
-        <w:keepLines/>
+        <w:keepNext/>
+        <w:keepLines/>
+        <w:spacing w:after="100" w:before="200"/>
       </w:pPr>
       <w:r>
         <w:rPr>
@@ -4933,9 +4925,9 @@
     <w:p>
       <w:pPr>
         <w:pStyle w:val="Heading2"/>
-        <w:spacing w:after="120" w:before="280"/>
-        <w:keepNext/>
-        <w:keepLines/>
+        <w:keepNext/>
+        <w:keepLines/>
+        <w:spacing w:after="100" w:before="200"/>
       </w:pPr>
       <w:r>
         <w:rPr>
@@ -5085,9 +5077,9 @@
     <w:p>
       <w:pPr>
         <w:pStyle w:val="Heading2"/>
-        <w:spacing w:after="120" w:before="280"/>
-        <w:keepNext/>
-        <w:keepLines/>
+        <w:keepNext/>
+        <w:keepLines/>
+        <w:spacing w:after="100" w:before="200"/>
       </w:pPr>
       <w:r>
         <w:rPr>
@@ -5118,9 +5110,9 @@
     <w:p>
       <w:pPr>
         <w:pStyle w:val="Heading2"/>
-        <w:spacing w:after="120" w:before="280"/>
-        <w:keepNext/>
-        <w:keepLines/>
+        <w:keepNext/>
+        <w:keepLines/>
+        <w:spacing w:after="100" w:before="200"/>
       </w:pPr>
       <w:r>
         <w:rPr>
@@ -5151,9 +5143,9 @@
     <w:p>
       <w:pPr>
         <w:pStyle w:val="Heading2"/>
-        <w:spacing w:after="120" w:before="280"/>
-        <w:keepNext/>
-        <w:keepLines/>
+        <w:keepNext/>
+        <w:keepLines/>
+        <w:spacing w:after="100" w:before="200"/>
       </w:pPr>
       <w:r>
         <w:rPr>
@@ -5184,9 +5176,9 @@
     <w:p>
       <w:pPr>
         <w:pStyle w:val="Heading2"/>
-        <w:spacing w:after="120" w:before="280"/>
-        <w:keepNext/>
-        <w:keepLines/>
+        <w:keepNext/>
+        <w:keepLines/>
+        <w:spacing w:after="100" w:before="200"/>
       </w:pPr>
       <w:r>
         <w:rPr>
@@ -5231,9 +5223,9 @@
     <w:p>
       <w:pPr>
         <w:pStyle w:val="Heading2"/>
-        <w:spacing w:after="120" w:before="280"/>
-        <w:keepNext/>
-        <w:keepLines/>
+        <w:keepNext/>
+        <w:keepLines/>
+        <w:spacing w:after="100" w:before="200"/>
       </w:pPr>
       <w:r>
         <w:rPr>
@@ -5553,7 +5545,13 @@
 <file path=word/styles.xml><?xml version="1.0" encoding="utf-8"?>
 <w:styles xmlns:mc="http://schemas.openxmlformats.org/markup-compatibility/2006" xmlns:r="http://schemas.openxmlformats.org/officeDocument/2006/relationships" xmlns:w="http://schemas.openxmlformats.org/wordprocessingml/2006/main" xmlns:w14="http://schemas.microsoft.com/office/word/2010/wordml" xmlns:w15="http://schemas.microsoft.com/office/word/2012/wordml" mc:Ignorable="w14 w15">
   <w:docDefaults>
-    <w:rPrDefault/>
+    <w:rPrDefault>
+      <w:rPr>
+        <w:rFonts w:ascii="Arial" w:cs="Arial" w:eastAsia="Arial" w:hAnsi="Arial"/>
+        <w:sz w:val="24"/>
+        <w:szCs w:val="24"/>
+      </w:rPr>
+    </w:rPrDefault>
     <w:pPrDefault/>
   </w:docDefaults>
   <w:style w:type="paragraph" w:styleId="Title">
@@ -5568,10 +5566,6 @@
   </w:style>
   <w:style w:type="paragraph" w:styleId="Heading1">
     <w:name w:val="Heading 1"/>
-    <w:pPr>
-      <w:keepNext/>
-      <w:keepLines/>
-    </w:pPr>
     <w:basedOn w:val="Normal"/>
     <w:next w:val="Normal"/>
     <w:qFormat/>
@@ -5583,10 +5577,6 @@
   </w:style>
   <w:style w:type="paragraph" w:styleId="Heading2">
     <w:name w:val="Heading 2"/>
-    <w:pPr>
-      <w:keepNext/>
-      <w:keepLines/>
-    </w:pPr>
     <w:basedOn w:val="Normal"/>
     <w:next w:val="Normal"/>
     <w:qFormat/>
@@ -5598,10 +5588,6 @@
   </w:style>
   <w:style w:type="paragraph" w:styleId="Heading3">
     <w:name w:val="Heading 3"/>
-    <w:pPr>
-      <w:keepNext/>
-      <w:keepLines/>
-    </w:pPr>
     <w:basedOn w:val="Normal"/>
     <w:next w:val="Normal"/>
     <w:qFormat/>
@@ -5739,5 +5725,62 @@
       <w:szCs w:val="20"/>
     </w:rPr>
   </w:style>
+  <w:style w:type="paragraph" w:styleId="Heading1">
+    <w:name w:val="Heading 1"/>
+    <w:basedOn w:val="Normal"/>
+    <w:next w:val="Normal"/>
+    <w:qFormat/>
+    <w:pPr>
+      <w:keepNext/>
+      <w:keepLines/>
+      <w:spacing w:after="120" w:before="240"/>
+      <w:outlineLvl w:val="0"/>
+    </w:pPr>
+    <w:rPr>
+      <w:rFonts w:ascii="Arial" w:cs="Arial" w:eastAsia="Arial" w:hAnsi="Arial"/>
+      <w:b/>
+      <w:bCs/>
+      <w:sz w:val="32"/>
+      <w:szCs w:val="32"/>
+    </w:rPr>
+  </w:style>
+  <w:style w:type="paragraph" w:styleId="Heading2">
+    <w:name w:val="Heading 2"/>
+    <w:basedOn w:val="Normal"/>
+    <w:next w:val="Normal"/>
+    <w:qFormat/>
+    <w:pPr>
+      <w:keepNext/>
+      <w:keepLines/>
+      <w:spacing w:after="100" w:before="200"/>
+      <w:outlineLvl w:val="1"/>
+    </w:pPr>
+    <w:rPr>
+      <w:rFonts w:ascii="Arial" w:cs="Arial" w:eastAsia="Arial" w:hAnsi="Arial"/>
+      <w:b/>
+      <w:bCs/>
+      <w:sz w:val="28"/>
+      <w:szCs w:val="28"/>
+    </w:rPr>
+  </w:style>
+  <w:style w:type="paragraph" w:styleId="Heading3">
+    <w:name w:val="Heading 3"/>
+    <w:basedOn w:val="Normal"/>
+    <w:next w:val="Normal"/>
+    <w:qFormat/>
+    <w:pPr>
+      <w:keepNext/>
+      <w:keepLines/>
+      <w:spacing w:after="80" w:before="160"/>
+      <w:outlineLvl w:val="2"/>
+    </w:pPr>
+    <w:rPr>
+      <w:rFonts w:ascii="Arial" w:cs="Arial" w:eastAsia="Arial" w:hAnsi="Arial"/>
+      <w:b/>
+      <w:bCs/>
+      <w:sz w:val="24"/>
+      <w:szCs w:val="24"/>
+    </w:rPr>
+  </w:style>
 </w:styles>
 </file>
</xml_diff>

<commit_message>
Fix orphaned headings + add PDF versions
- Removed spacer paragraphs before headings that caused bad page breaks
- Heading keepNext ensures headings always appear with body text
- Reduced heading spacing for tighter, cleaner layout
- Added PDF versions of all 9 documents for easy viewing on GitHub
- WMA 'Fee Deduction' no longer orphaned on page 2 bottom
</commit_message>
<xml_diff>
--- a/revised-april-2026/BWP_ADV_Part_2A___2B(v.04.2026).docx
+++ b/revised-april-2026/BWP_ADV_Part_2A___2B(v.04.2026).docx
@@ -1,6 +1,6 @@
 
 <file path=word/document.xml><?xml version="1.0" encoding="utf-8"?>
-<w:document xmlns:wpc="http://schemas.microsoft.com/office/word/2010/wordprocessingCanvas" xmlns:mc="http://schemas.openxmlformats.org/markup-compatibility/2006" xmlns:o="urn:schemas-microsoft-com:office:office" xmlns:r="http://schemas.openxmlformats.org/officeDocument/2006/relationships" xmlns:m="http://schemas.openxmlformats.org/officeDocument/2006/math" xmlns:v="urn:schemas-microsoft-com:vml" xmlns:wp14="http://schemas.microsoft.com/office/word/2010/wordprocessingDrawing" xmlns:wp="http://schemas.openxmlformats.org/drawingml/2006/wordprocessingDrawing" xmlns:w10="urn:schemas-microsoft-com:office:word" xmlns:w="http://schemas.openxmlformats.org/wordprocessingml/2006/main" xmlns:w14="http://schemas.microsoft.com/office/word/2010/wordml" xmlns:w15="http://schemas.microsoft.com/office/word/2012/wordml" xmlns:wpg="http://schemas.microsoft.com/office/word/2010/wordprocessingGroup" xmlns:wpi="http://schemas.microsoft.com/office/word/2010/wordprocessingInk" xmlns:wne="http://schemas.microsoft.com/office/word/2006/wordml" xmlns:wps="http://schemas.microsoft.com/office/word/2010/wordprocessingShape" xmlns:cx="http://schemas.microsoft.com/office/drawing/2014/chartex" xmlns:cx1="http://schemas.microsoft.com/office/drawing/2015/9/8/chartex" xmlns:cx2="http://schemas.microsoft.com/office/drawing/2015/10/21/chartex" xmlns:cx3="http://schemas.microsoft.com/office/drawing/2016/5/9/chartex" xmlns:cx4="http://schemas.microsoft.com/office/drawing/2016/5/10/chartex" xmlns:cx5="http://schemas.microsoft.com/office/drawing/2016/5/11/chartex" xmlns:cx6="http://schemas.microsoft.com/office/drawing/2016/5/12/chartex" xmlns:cx7="http://schemas.microsoft.com/office/drawing/2016/5/13/chartex" xmlns:cx8="http://schemas.microsoft.com/office/drawing/2016/5/14/chartex" xmlns:aink="http://schemas.microsoft.com/office/drawing/2016/ink" xmlns:am3d="http://schemas.microsoft.com/office/drawing/2017/model3d" xmlns:w16cex="http://schemas.microsoft.com/office/word/2018/wordml/cex" xmlns:w16cid="http://schemas.microsoft.com/office/word/2016/wordml/cid" xmlns:w16="http://schemas.microsoft.com/office/word/2018/wordml" xmlns:w16sdtdh="http://schemas.microsoft.com/office/word/2020/wordml/sdtdatahash" xmlns:w16se="http://schemas.microsoft.com/office/word/2015/wordml/symex" mc:Ignorable="w14 w15 wp14">
+<w:document xmlns:mc="http://schemas.openxmlformats.org/markup-compatibility/2006" xmlns:r="http://schemas.openxmlformats.org/officeDocument/2006/relationships" xmlns:w="http://schemas.openxmlformats.org/wordprocessingml/2006/main" mc:Ignorable="w14 w15 wp14">
   <w:body>
     <w:p>
       <w:pPr>
@@ -138,11 +138,6 @@
           <w:szCs w:val="20"/>
         </w:rPr>
         <w:t xml:space="preserve">Additional information is also available on the SEC's website at www.adviserinfo.sec.gov using CRD# 126428.</w:t>
-      </w:r>
-    </w:p>
-    <w:p>
-      <w:r>
-        <w:br w:type="page"/>
       </w:r>
     </w:p>
     <w:p>
@@ -3979,14 +3974,6 @@
     </w:p>
     <w:p>
       <w:pPr>
-        <w:pBdr>
-          <w:bottom w:color="CCCCCC" w:sz="6" w:space="1"/>
-        </w:pBdr>
-        <w:spacing w:after="160" w:before="160"/>
-      </w:pPr>
-    </w:p>
-    <w:p>
-      <w:pPr>
         <w:pStyle w:val="Heading2"/>
         <w:keepNext/>
         <w:keepLines/>
@@ -4196,11 +4183,6 @@
           <w:szCs w:val="20"/>
         </w:rPr>
         <w:t xml:space="preserve">Additional information about Jim Kilgore, CFP® and William DeShurko is available on the SEC's website at www.adviserinfo.sec.gov which can be found using the identification numbers CRD# 6695352 (Jim) or 1717919 (Bill).</w:t>
-      </w:r>
-    </w:p>
-    <w:p>
-      <w:r>
-        <w:br w:type="page"/>
       </w:r>
     </w:p>
     <w:p>
@@ -4814,11 +4796,6 @@
           <w:szCs w:val="24"/>
         </w:rPr>
         <w:t xml:space="preserve">Jim Kilgore has NOT been involved in an arbitration, civil proceeding, self-regulatory proceeding, administrative proceeding, or a bankruptcy petition.</w:t>
-      </w:r>
-    </w:p>
-    <w:p>
-      <w:r>
-        <w:br w:type="page"/>
       </w:r>
     </w:p>
     <w:p>

</xml_diff>